<commit_message>
updated skills top part
</commit_message>
<xml_diff>
--- a/resumes/zachary-cortinovis-resume-mar2026.docx
+++ b/resumes/zachary-cortinovis-resume-mar2026.docx
@@ -32,7 +32,7 @@
         <w:pStyle w:val="Heading2"/>
         <w:rPr>
           <w:rFonts w:ascii="Helvetica" w:hAnsi="Helvetica"/>
-          <w:color w:val="548DD4" w:themeColor="text2" w:themeTint="99"/>
+          <w:color w:val="4F81BD" w:themeColor="accent1"/>
           <w:sz w:val="28"/>
           <w:szCs w:val="28"/>
         </w:rPr>
@@ -42,7 +42,7 @@
       <w:r>
         <w:rPr>
           <w:rFonts w:ascii="Helvetica" w:hAnsi="Helvetica"/>
-          <w:color w:val="548DD4" w:themeColor="text2" w:themeTint="99"/>
+          <w:color w:val="4F81BD" w:themeColor="accent1"/>
           <w:sz w:val="28"/>
           <w:szCs w:val="28"/>
         </w:rPr>
@@ -109,7 +109,7 @@
         <w:r>
           <w:rPr>
             <w:rFonts w:ascii="Helvetica" w:hAnsi="Helvetica"/>
-            <w:color w:val="548DD4" w:themeColor="text2" w:themeTint="99"/>
+            <w:color w:val="1155CC"/>
             <w:sz w:val="20"/>
             <w:szCs w:val="20"/>
             <w:highlight w:val="white"/>
@@ -123,7 +123,6 @@
           <w:rFonts w:ascii="Helvetica" w:hAnsi="Helvetica"/>
           <w:b/>
           <w:bCs/>
-          <w:color w:val="548DD4" w:themeColor="text2" w:themeTint="99"/>
           <w:sz w:val="20"/>
           <w:szCs w:val="20"/>
         </w:rPr>
@@ -150,7 +149,6 @@
       <w:r>
         <w:rPr>
           <w:rFonts w:ascii="Helvetica" w:hAnsi="Helvetica"/>
-          <w:color w:val="548DD4" w:themeColor="text2" w:themeTint="99"/>
           <w:sz w:val="20"/>
           <w:szCs w:val="20"/>
         </w:rPr>
@@ -159,34 +157,30 @@
       <w:r>
         <w:rPr>
           <w:rFonts w:ascii="Helvetica" w:hAnsi="Helvetica"/>
-          <w:color w:val="548DD4" w:themeColor="text2" w:themeTint="99"/>
         </w:rPr>
         <w:fldChar w:fldCharType="begin"/>
       </w:r>
       <w:r>
         <w:rPr>
           <w:rFonts w:ascii="Helvetica" w:hAnsi="Helvetica"/>
-          <w:color w:val="548DD4" w:themeColor="text2" w:themeTint="99"/>
         </w:rPr>
         <w:instrText>HYPERLINK "https://www.linkedin.com/in/zacharycortinovis/" \h</w:instrText>
       </w:r>
       <w:r>
         <w:rPr>
           <w:rFonts w:ascii="Helvetica" w:hAnsi="Helvetica"/>
-          <w:color w:val="548DD4" w:themeColor="text2" w:themeTint="99"/>
-        </w:rPr>
-      </w:r>
-      <w:r>
-        <w:rPr>
-          <w:rFonts w:ascii="Helvetica" w:hAnsi="Helvetica"/>
-          <w:color w:val="548DD4" w:themeColor="text2" w:themeTint="99"/>
+        </w:rPr>
+      </w:r>
+      <w:r>
+        <w:rPr>
+          <w:rFonts w:ascii="Helvetica" w:hAnsi="Helvetica"/>
         </w:rPr>
         <w:fldChar w:fldCharType="separate"/>
       </w:r>
       <w:r>
         <w:rPr>
           <w:rFonts w:ascii="Helvetica" w:hAnsi="Helvetica"/>
-          <w:color w:val="548DD4" w:themeColor="text2" w:themeTint="99"/>
+          <w:color w:val="1155CC"/>
           <w:sz w:val="20"/>
           <w:szCs w:val="20"/>
           <w:u w:val="single"/>
@@ -196,7 +190,7 @@
       <w:r>
         <w:rPr>
           <w:rFonts w:ascii="Helvetica" w:hAnsi="Helvetica"/>
-          <w:color w:val="548DD4" w:themeColor="text2" w:themeTint="99"/>
+          <w:color w:val="1155CC"/>
           <w:sz w:val="20"/>
           <w:szCs w:val="20"/>
           <w:u w:val="single"/>
@@ -206,7 +200,7 @@
       <w:r>
         <w:rPr>
           <w:rFonts w:ascii="Helvetica" w:hAnsi="Helvetica"/>
-          <w:color w:val="548DD4" w:themeColor="text2" w:themeTint="99"/>
+          <w:color w:val="1155CC"/>
           <w:sz w:val="20"/>
           <w:szCs w:val="20"/>
           <w:u w:val="single"/>
@@ -216,7 +210,6 @@
       <w:r>
         <w:rPr>
           <w:rFonts w:ascii="Helvetica" w:hAnsi="Helvetica"/>
-          <w:color w:val="548DD4" w:themeColor="text2" w:themeTint="99"/>
         </w:rPr>
         <w:fldChar w:fldCharType="end"/>
       </w:r>
@@ -268,7 +261,7 @@
         <w:r>
           <w:rPr>
             <w:rFonts w:ascii="Helvetica" w:hAnsi="Helvetica"/>
-            <w:color w:val="548DD4" w:themeColor="text2" w:themeTint="99"/>
+            <w:color w:val="1155CC"/>
             <w:sz w:val="20"/>
             <w:szCs w:val="20"/>
             <w:u w:val="single"/>
@@ -278,7 +271,7 @@
         <w:r>
           <w:rPr>
             <w:rFonts w:ascii="Helvetica" w:hAnsi="Helvetica"/>
-            <w:color w:val="548DD4" w:themeColor="text2" w:themeTint="99"/>
+            <w:color w:val="1155CC"/>
             <w:sz w:val="20"/>
             <w:szCs w:val="20"/>
             <w:u w:val="single"/>
@@ -288,7 +281,7 @@
         <w:r>
           <w:rPr>
             <w:rFonts w:ascii="Helvetica" w:hAnsi="Helvetica"/>
-            <w:color w:val="548DD4" w:themeColor="text2" w:themeTint="99"/>
+            <w:color w:val="1155CC"/>
             <w:sz w:val="20"/>
             <w:szCs w:val="20"/>
             <w:u w:val="single"/>
@@ -307,7 +300,7 @@
           <w:right w:val="nil"/>
           <w:between w:val="nil"/>
         </w:pBdr>
-        <w:shd w:val="clear" w:color="auto" w:fill="B3E3C8"/>
+        <w:shd w:val="clear" w:color="auto" w:fill="A9DDAF"/>
         <w:ind w:left="-86" w:right="-130" w:firstLine="86"/>
         <w:rPr>
           <w:rFonts w:ascii="Helvetica" w:hAnsi="Helvetica"/>
@@ -484,7 +477,7 @@
           <w:right w:val="nil"/>
           <w:between w:val="nil"/>
         </w:pBdr>
-        <w:shd w:val="clear" w:color="auto" w:fill="B3E3C8"/>
+        <w:shd w:val="clear" w:color="auto" w:fill="A9DDAF"/>
         <w:ind w:left="-86" w:right="-130" w:firstLine="86"/>
         <w:rPr>
           <w:rFonts w:ascii="Helvetica" w:hAnsi="Helvetica"/>
@@ -570,22 +563,11 @@
           <w:rFonts w:ascii="Helvetica" w:eastAsia="Arial Unicode MS" w:hAnsi="Helvetica" w:cs="Arial Unicode MS"/>
           <w:b/>
           <w:bCs/>
-          <w:color w:val="548DD4" w:themeColor="text2" w:themeTint="99"/>
-          <w:sz w:val="24"/>
-          <w:szCs w:val="24"/>
-        </w:rPr>
-        <w:t>Product Manager</w:t>
-      </w:r>
-      <w:r>
-        <w:rPr>
-          <w:rFonts w:ascii="Helvetica" w:eastAsia="Arial Unicode MS" w:hAnsi="Helvetica" w:cs="Arial Unicode MS"/>
-          <w:b/>
-          <w:bCs/>
           <w:color w:val="4F81BD" w:themeColor="accent1"/>
           <w:sz w:val="24"/>
           <w:szCs w:val="24"/>
         </w:rPr>
-        <w:t xml:space="preserve"> </w:t>
+        <w:t xml:space="preserve">Product Manager </w:t>
       </w:r>
       <w:r>
         <w:rPr>
@@ -779,7 +761,6 @@
           <w:rPr>
             <w:rStyle w:val="Hyperlink"/>
             <w:rFonts w:ascii="Helvetica" w:hAnsi="Helvetica"/>
-            <w:color w:val="548DD4" w:themeColor="text2" w:themeTint="99"/>
             <w:sz w:val="24"/>
             <w:szCs w:val="24"/>
           </w:rPr>
@@ -789,7 +770,6 @@
           <w:rPr>
             <w:rStyle w:val="Hyperlink"/>
             <w:rFonts w:ascii="Helvetica" w:hAnsi="Helvetica"/>
-            <w:color w:val="548DD4" w:themeColor="text2" w:themeTint="99"/>
             <w:sz w:val="24"/>
             <w:szCs w:val="24"/>
           </w:rPr>
@@ -799,7 +779,6 @@
           <w:rPr>
             <w:rStyle w:val="Hyperlink"/>
             <w:rFonts w:ascii="Helvetica" w:hAnsi="Helvetica"/>
-            <w:color w:val="548DD4" w:themeColor="text2" w:themeTint="99"/>
             <w:sz w:val="24"/>
             <w:szCs w:val="24"/>
           </w:rPr>
@@ -809,7 +788,6 @@
           <w:rPr>
             <w:rStyle w:val="Hyperlink"/>
             <w:rFonts w:ascii="Helvetica" w:hAnsi="Helvetica"/>
-            <w:color w:val="548DD4" w:themeColor="text2" w:themeTint="99"/>
             <w:sz w:val="24"/>
             <w:szCs w:val="24"/>
           </w:rPr>
@@ -819,26 +797,16 @@
       <w:r>
         <w:rPr>
           <w:rFonts w:ascii="Helvetica" w:hAnsi="Helvetica"/>
-          <w:color w:val="548DD4" w:themeColor="text2" w:themeTint="99"/>
-          <w:sz w:val="24"/>
-          <w:szCs w:val="24"/>
-        </w:rPr>
-        <w:t xml:space="preserve"> </w:t>
-      </w:r>
-      <w:r>
-        <w:rPr>
-          <w:rFonts w:ascii="Helvetica" w:hAnsi="Helvetica"/>
-          <w:sz w:val="24"/>
-          <w:szCs w:val="24"/>
-        </w:rPr>
-        <w:t xml:space="preserve">and </w:t>
+          <w:sz w:val="24"/>
+          <w:szCs w:val="24"/>
+        </w:rPr>
+        <w:t xml:space="preserve"> and </w:t>
       </w:r>
       <w:hyperlink r:id="rId11" w:history="1">
         <w:r>
           <w:rPr>
             <w:rStyle w:val="Hyperlink"/>
             <w:rFonts w:ascii="Helvetica" w:hAnsi="Helvetica"/>
-            <w:color w:val="548DD4" w:themeColor="text2" w:themeTint="99"/>
             <w:sz w:val="24"/>
             <w:szCs w:val="24"/>
           </w:rPr>
@@ -1217,17 +1185,17 @@
           <w:rFonts w:ascii="Helvetica" w:hAnsi="Helvetica"/>
           <w:b/>
           <w:bCs/>
-          <w:color w:val="548DD4" w:themeColor="text2" w:themeTint="99"/>
-          <w:sz w:val="24"/>
-          <w:szCs w:val="24"/>
-        </w:rPr>
-      </w:pPr>
-      <w:r>
-        <w:rPr>
-          <w:rFonts w:ascii="Helvetica" w:hAnsi="Helvetica"/>
-          <w:b/>
-          <w:bCs/>
-          <w:color w:val="548DD4" w:themeColor="text2" w:themeTint="99"/>
+          <w:color w:val="4F81BD" w:themeColor="accent1"/>
+          <w:sz w:val="24"/>
+          <w:szCs w:val="24"/>
+        </w:rPr>
+      </w:pPr>
+      <w:r>
+        <w:rPr>
+          <w:rFonts w:ascii="Helvetica" w:hAnsi="Helvetica"/>
+          <w:b/>
+          <w:bCs/>
+          <w:color w:val="4F81BD" w:themeColor="accent1"/>
           <w:sz w:val="24"/>
           <w:szCs w:val="24"/>
         </w:rPr>
@@ -1392,7 +1360,7 @@
           <w:rFonts w:ascii="Helvetica" w:hAnsi="Helvetica"/>
           <w:b/>
           <w:bCs/>
-          <w:color w:val="548DD4" w:themeColor="text2" w:themeTint="99"/>
+          <w:color w:val="4F81BD" w:themeColor="accent1"/>
           <w:sz w:val="24"/>
           <w:szCs w:val="24"/>
         </w:rPr>
@@ -1593,7 +1561,7 @@
     </w:p>
     <w:p>
       <w:pPr>
-        <w:shd w:val="clear" w:color="auto" w:fill="B3E3C8"/>
+        <w:shd w:val="clear" w:color="auto" w:fill="A9DDAF"/>
         <w:tabs>
           <w:tab w:val="left" w:pos="4500"/>
         </w:tabs>
@@ -1629,15 +1597,15 @@
           <w:rFonts w:ascii="Helvetica" w:hAnsi="Helvetica"/>
           <w:b/>
           <w:bCs/>
-          <w:color w:val="548DD4" w:themeColor="text2" w:themeTint="99"/>
-        </w:rPr>
-      </w:pPr>
-      <w:r>
-        <w:rPr>
-          <w:rFonts w:ascii="Helvetica" w:hAnsi="Helvetica"/>
-          <w:b/>
-          <w:bCs/>
-          <w:color w:val="548DD4" w:themeColor="text2" w:themeTint="99"/>
+          <w:color w:val="4F81BD" w:themeColor="accent1"/>
+        </w:rPr>
+      </w:pPr>
+      <w:r>
+        <w:rPr>
+          <w:rFonts w:ascii="Helvetica" w:hAnsi="Helvetica"/>
+          <w:b/>
+          <w:bCs/>
+          <w:color w:val="4F81BD" w:themeColor="accent1"/>
         </w:rPr>
         <w:t>Texas State University</w:t>
       </w:r>
@@ -1681,7 +1649,7 @@
     </w:p>
     <w:p>
       <w:pPr>
-        <w:shd w:val="clear" w:color="auto" w:fill="B3E3C8"/>
+        <w:shd w:val="clear" w:color="auto" w:fill="92CDDC" w:themeFill="accent5" w:themeFillTint="99"/>
         <w:ind w:left="-450" w:right="-98" w:firstLine="450"/>
         <w:rPr>
           <w:rFonts w:ascii="Helvetica" w:hAnsi="Helvetica"/>
@@ -1709,15 +1677,15 @@
           <w:rFonts w:ascii="Helvetica" w:hAnsi="Helvetica"/>
           <w:b/>
           <w:bCs/>
-          <w:color w:val="548DD4" w:themeColor="text2" w:themeTint="99"/>
-        </w:rPr>
-      </w:pPr>
-      <w:r>
-        <w:rPr>
-          <w:rFonts w:ascii="Helvetica" w:hAnsi="Helvetica"/>
-          <w:b/>
-          <w:bCs/>
-          <w:color w:val="548DD4" w:themeColor="text2" w:themeTint="99"/>
+          <w:color w:val="4F81BD" w:themeColor="accent1"/>
+        </w:rPr>
+      </w:pPr>
+      <w:r>
+        <w:rPr>
+          <w:rFonts w:ascii="Helvetica" w:hAnsi="Helvetica"/>
+          <w:b/>
+          <w:bCs/>
+          <w:color w:val="4F81BD" w:themeColor="accent1"/>
         </w:rPr>
         <w:t xml:space="preserve">Figma </w:t>
       </w:r>
@@ -1726,7 +1694,7 @@
           <w:rFonts w:ascii="Helvetica" w:hAnsi="Helvetica"/>
           <w:b/>
           <w:bCs/>
-          <w:color w:val="548DD4" w:themeColor="text2" w:themeTint="99"/>
+          <w:color w:val="4F81BD" w:themeColor="accent1"/>
         </w:rPr>
         <w:t>-</w:t>
       </w:r>
@@ -1735,7 +1703,7 @@
           <w:rFonts w:ascii="Helvetica" w:hAnsi="Helvetica"/>
           <w:b/>
           <w:bCs/>
-          <w:color w:val="548DD4" w:themeColor="text2" w:themeTint="99"/>
+          <w:color w:val="4F81BD" w:themeColor="accent1"/>
         </w:rPr>
         <w:t xml:space="preserve"> </w:t>
       </w:r>
@@ -1744,7 +1712,7 @@
           <w:rFonts w:ascii="Helvetica" w:hAnsi="Helvetica"/>
           <w:b/>
           <w:bCs/>
-          <w:color w:val="548DD4" w:themeColor="text2" w:themeTint="99"/>
+          <w:color w:val="4F81BD" w:themeColor="accent1"/>
         </w:rPr>
         <w:t>Blender - Adobe - Cursor - Claude</w:t>
       </w:r>
@@ -3155,7 +3123,7 @@
 </file>
 
 <file path=customXml/itemProps1.xml><?xml version="1.0" encoding="utf-8"?>
-<ds:datastoreItem xmlns:ds="http://schemas.openxmlformats.org/officeDocument/2006/customXml" ds:itemID="{47D79DE7-6DEB-4F4D-A3A6-B4B0F74A7671}">
+<ds:datastoreItem xmlns:ds="http://schemas.openxmlformats.org/officeDocument/2006/customXml" ds:itemID="{0ADDB99B-5F78-EA4C-9ED6-0EB27590E9A5}">
   <ds:schemaRefs>
     <ds:schemaRef ds:uri="http://schemas.openxmlformats.org/officeDocument/2006/bibliography"/>
   </ds:schemaRefs>

</xml_diff>

<commit_message>
Updated photos and added some other stuff on services
</commit_message>
<xml_diff>
--- a/resumes/zachary-cortinovis-resume-mar2026.docx
+++ b/resumes/zachary-cortinovis-resume-mar2026.docx
@@ -75,7 +75,15 @@
           <w:color w:val="948A54" w:themeColor="background2" w:themeShade="80"/>
           <w:highlight w:val="white"/>
         </w:rPr>
-        <w:t>Georgetown, TX — Austin Metropolitan Area</w:t>
+        <w:t>Round Rock</w:t>
+      </w:r>
+      <w:r>
+        <w:rPr>
+          <w:rFonts w:ascii="Helvetica" w:hAnsi="Helvetica"/>
+          <w:color w:val="948A54" w:themeColor="background2" w:themeShade="80"/>
+          <w:highlight w:val="white"/>
+        </w:rPr>
+        <w:t>, TX — Austin Metropolitan Area</w:t>
       </w:r>
     </w:p>
     <w:p>
@@ -117,29 +125,7 @@
             <w:highlight w:val="white"/>
             <w:u w:val="single"/>
           </w:rPr>
-          <w:t>z</w:t>
-        </w:r>
-        <w:r>
-          <w:rPr>
-            <w:rFonts w:ascii="Helvetica" w:hAnsi="Helvetica"/>
-            <w:color w:val="1155CC"/>
-            <w:sz w:val="20"/>
-            <w:szCs w:val="20"/>
-            <w:highlight w:val="white"/>
-            <w:u w:val="single"/>
-          </w:rPr>
-          <w:t>a</w:t>
-        </w:r>
-        <w:r>
-          <w:rPr>
-            <w:rFonts w:ascii="Helvetica" w:hAnsi="Helvetica"/>
-            <w:color w:val="1155CC"/>
-            <w:sz w:val="20"/>
-            <w:szCs w:val="20"/>
-            <w:highlight w:val="white"/>
-            <w:u w:val="single"/>
-          </w:rPr>
-          <w:t>charycortinovis@gmail.com</w:t>
+          <w:t>zacharycortinovis@gmail.com</w:t>
         </w:r>
       </w:hyperlink>
       <w:r>
@@ -169,99 +155,6 @@
           <w:szCs w:val="20"/>
         </w:rPr>
         <w:t>LinkedIn</w:t>
-      </w:r>
-      <w:r>
-        <w:rPr>
-          <w:rFonts w:ascii="Helvetica" w:hAnsi="Helvetica"/>
-          <w:sz w:val="20"/>
-          <w:szCs w:val="20"/>
-        </w:rPr>
-        <w:t xml:space="preserve"> </w:t>
-      </w:r>
-      <w:r>
-        <w:rPr>
-          <w:rFonts w:ascii="Helvetica" w:hAnsi="Helvetica"/>
-        </w:rPr>
-        <w:fldChar w:fldCharType="begin"/>
-      </w:r>
-      <w:r>
-        <w:rPr>
-          <w:rFonts w:ascii="Helvetica" w:hAnsi="Helvetica"/>
-        </w:rPr>
-        <w:instrText>HYPERLINK "https://www.linkedin.com/in/zacharycortinovis/" \h</w:instrText>
-      </w:r>
-      <w:r>
-        <w:rPr>
-          <w:rFonts w:ascii="Helvetica" w:hAnsi="Helvetica"/>
-        </w:rPr>
-      </w:r>
-      <w:r>
-        <w:rPr>
-          <w:rFonts w:ascii="Helvetica" w:hAnsi="Helvetica"/>
-        </w:rPr>
-        <w:fldChar w:fldCharType="separate"/>
-      </w:r>
-      <w:r>
-        <w:rPr>
-          <w:rFonts w:ascii="Helvetica" w:hAnsi="Helvetica"/>
-          <w:color w:val="1155CC"/>
-          <w:sz w:val="20"/>
-          <w:szCs w:val="20"/>
-          <w:u w:val="single"/>
-        </w:rPr>
-        <w:t>linkedin.com/</w:t>
-      </w:r>
-      <w:r>
-        <w:rPr>
-          <w:rFonts w:ascii="Helvetica" w:hAnsi="Helvetica"/>
-          <w:color w:val="1155CC"/>
-          <w:sz w:val="20"/>
-          <w:szCs w:val="20"/>
-          <w:u w:val="single"/>
-        </w:rPr>
-        <w:t>i</w:t>
-      </w:r>
-      <w:r>
-        <w:rPr>
-          <w:rFonts w:ascii="Helvetica" w:hAnsi="Helvetica"/>
-          <w:color w:val="1155CC"/>
-          <w:sz w:val="20"/>
-          <w:szCs w:val="20"/>
-          <w:u w:val="single"/>
-        </w:rPr>
-        <w:t>n/zacharycortinovis</w:t>
-      </w:r>
-      <w:r>
-        <w:rPr>
-          <w:rFonts w:ascii="Helvetica" w:hAnsi="Helvetica"/>
-        </w:rPr>
-        <w:fldChar w:fldCharType="end"/>
-      </w:r>
-      <w:bookmarkStart w:id="2" w:name="_7go2rngca6d7" w:colFirst="0" w:colLast="0"/>
-      <w:bookmarkEnd w:id="2"/>
-      <w:r>
-        <w:rPr>
-          <w:rFonts w:ascii="Helvetica" w:hAnsi="Helvetica"/>
-        </w:rPr>
-        <w:t xml:space="preserve"> </w:t>
-      </w:r>
-      <w:r>
-        <w:rPr>
-          <w:rFonts w:ascii="Helvetica" w:hAnsi="Helvetica"/>
-          <w:sz w:val="20"/>
-          <w:szCs w:val="20"/>
-        </w:rPr>
-        <w:t xml:space="preserve">| </w:t>
-      </w:r>
-      <w:r>
-        <w:rPr>
-          <w:rFonts w:ascii="Helvetica" w:hAnsi="Helvetica"/>
-          <w:b/>
-          <w:bCs/>
-          <w:sz w:val="20"/>
-          <w:szCs w:val="20"/>
-        </w:rPr>
-        <w:t>Website:</w:t>
       </w:r>
       <w:r>
         <w:rPr>
@@ -280,8 +173,44 @@
             <w:szCs w:val="20"/>
             <w:u w:val="single"/>
           </w:rPr>
-          <w:t>zacharycortin</w:t>
+          <w:t>linkedin.com/in/zacharycortinovis</w:t>
         </w:r>
+      </w:hyperlink>
+      <w:bookmarkStart w:id="2" w:name="_7go2rngca6d7" w:colFirst="0" w:colLast="0"/>
+      <w:bookmarkEnd w:id="2"/>
+      <w:r>
+        <w:rPr>
+          <w:rFonts w:ascii="Helvetica" w:hAnsi="Helvetica"/>
+        </w:rPr>
+        <w:t xml:space="preserve"> </w:t>
+      </w:r>
+      <w:r>
+        <w:rPr>
+          <w:rFonts w:ascii="Helvetica" w:hAnsi="Helvetica"/>
+          <w:sz w:val="20"/>
+          <w:szCs w:val="20"/>
+        </w:rPr>
+        <w:t xml:space="preserve">| </w:t>
+      </w:r>
+      <w:r>
+        <w:rPr>
+          <w:rFonts w:ascii="Helvetica" w:hAnsi="Helvetica"/>
+          <w:b/>
+          <w:bCs/>
+          <w:sz w:val="20"/>
+          <w:szCs w:val="20"/>
+        </w:rPr>
+        <w:t>Website:</w:t>
+      </w:r>
+      <w:r>
+        <w:rPr>
+          <w:rFonts w:ascii="Helvetica" w:hAnsi="Helvetica"/>
+          <w:sz w:val="20"/>
+          <w:szCs w:val="20"/>
+        </w:rPr>
+        <w:t xml:space="preserve"> </w:t>
+      </w:r>
+      <w:hyperlink r:id="rId10">
         <w:r>
           <w:rPr>
             <w:rFonts w:ascii="Helvetica" w:hAnsi="Helvetica"/>
@@ -290,17 +219,7 @@
             <w:szCs w:val="20"/>
             <w:u w:val="single"/>
           </w:rPr>
-          <w:t>o</w:t>
-        </w:r>
-        <w:r>
-          <w:rPr>
-            <w:rFonts w:ascii="Helvetica" w:hAnsi="Helvetica"/>
-            <w:color w:val="1155CC"/>
-            <w:sz w:val="20"/>
-            <w:szCs w:val="20"/>
-            <w:u w:val="single"/>
-          </w:rPr>
-          <w:t>vis.com</w:t>
+          <w:t>zacharycortinovis.com</w:t>
         </w:r>
       </w:hyperlink>
     </w:p>
@@ -833,7 +752,7 @@
         </w:rPr>
         <w:t xml:space="preserve"> designing, building, and managing </w:t>
       </w:r>
-      <w:hyperlink r:id="rId10" w:history="1">
+      <w:hyperlink r:id="rId11" w:history="1">
         <w:r>
           <w:rPr>
             <w:rStyle w:val="Hyperlink"/>
@@ -841,25 +760,7 @@
             <w:sz w:val="24"/>
             <w:szCs w:val="24"/>
           </w:rPr>
-          <w:t>Glob</w:t>
-        </w:r>
-        <w:r>
-          <w:rPr>
-            <w:rStyle w:val="Hyperlink"/>
-            <w:rFonts w:ascii="Helvetica" w:hAnsi="Helvetica"/>
-            <w:sz w:val="24"/>
-            <w:szCs w:val="24"/>
-          </w:rPr>
-          <w:t>a</w:t>
-        </w:r>
-        <w:r>
-          <w:rPr>
-            <w:rStyle w:val="Hyperlink"/>
-            <w:rFonts w:ascii="Helvetica" w:hAnsi="Helvetica"/>
-            <w:sz w:val="24"/>
-            <w:szCs w:val="24"/>
-          </w:rPr>
-          <w:t>lSKU</w:t>
+          <w:t>GlobalSKU</w:t>
         </w:r>
         <w:r>
           <w:rPr>
@@ -879,7 +780,7 @@
         </w:rPr>
         <w:t xml:space="preserve"> and </w:t>
       </w:r>
-      <w:hyperlink r:id="rId11" w:history="1">
+      <w:hyperlink r:id="rId12" w:history="1">
         <w:r>
           <w:rPr>
             <w:rStyle w:val="Hyperlink"/>
@@ -1116,10 +1017,12 @@
           <w:szCs w:val="24"/>
         </w:rPr>
         <w:sectPr>
-          <w:headerReference w:type="even" r:id="rId12"/>
-          <w:headerReference w:type="default" r:id="rId13"/>
-          <w:footerReference w:type="default" r:id="rId14"/>
-          <w:headerReference w:type="first" r:id="rId15"/>
+          <w:headerReference w:type="even" r:id="rId13"/>
+          <w:headerReference w:type="default" r:id="rId14"/>
+          <w:footerReference w:type="even" r:id="rId15"/>
+          <w:footerReference w:type="default" r:id="rId16"/>
+          <w:headerReference w:type="first" r:id="rId17"/>
+          <w:footerReference w:type="first" r:id="rId18"/>
           <w:pgSz w:w="12240" w:h="15840"/>
           <w:pgMar w:top="283" w:right="425" w:bottom="283" w:left="425" w:header="0" w:footer="720" w:gutter="0"/>
           <w:pgNumType w:start="1"/>
@@ -1901,6 +1804,16 @@
 </file>
 
 <file path=word/footer1.xml><?xml version="1.0" encoding="utf-8"?>
+<w:ftr xmlns:wpc="http://schemas.microsoft.com/office/word/2010/wordprocessingCanvas" xmlns:cx="http://schemas.microsoft.com/office/drawing/2014/chartex" xmlns:cx1="http://schemas.microsoft.com/office/drawing/2015/9/8/chartex" xmlns:cx2="http://schemas.microsoft.com/office/drawing/2015/10/21/chartex" xmlns:cx3="http://schemas.microsoft.com/office/drawing/2016/5/9/chartex" xmlns:cx4="http://schemas.microsoft.com/office/drawing/2016/5/10/chartex" xmlns:cx5="http://schemas.microsoft.com/office/drawing/2016/5/11/chartex" xmlns:cx6="http://schemas.microsoft.com/office/drawing/2016/5/12/chartex" xmlns:cx7="http://schemas.microsoft.com/office/drawing/2016/5/13/chartex" xmlns:cx8="http://schemas.microsoft.com/office/drawing/2016/5/14/chartex" xmlns:mc="http://schemas.openxmlformats.org/markup-compatibility/2006" xmlns:aink="http://schemas.microsoft.com/office/drawing/2016/ink" xmlns:am3d="http://schemas.microsoft.com/office/drawing/2017/model3d" xmlns:o="urn:schemas-microsoft-com:office:office" xmlns:oel="http://schemas.microsoft.com/office/2019/extlst" xmlns:r="http://schemas.openxmlformats.org/officeDocument/2006/relationships" xmlns:m="http://schemas.openxmlformats.org/officeDocument/2006/math" xmlns:v="urn:schemas-microsoft-com:vml" xmlns:wp14="http://schemas.microsoft.com/office/word/2010/wordprocessingDrawing" xmlns:wp="http://schemas.openxmlformats.org/drawingml/2006/wordprocessingDrawing" xmlns:w10="urn:schemas-microsoft-com:office:word" xmlns:w="http://schemas.openxmlformats.org/wordprocessingml/2006/main" xmlns:w14="http://schemas.microsoft.com/office/word/2010/wordml" xmlns:w15="http://schemas.microsoft.com/office/word/2012/wordml" xmlns:w16cex="http://schemas.microsoft.com/office/word/2018/wordml/cex" xmlns:w16cid="http://schemas.microsoft.com/office/word/2016/wordml/cid" xmlns:w16="http://schemas.microsoft.com/office/word/2018/wordml" xmlns:w16du="http://schemas.microsoft.com/office/word/2023/wordml/word16du" xmlns:w16sdtdh="http://schemas.microsoft.com/office/word/2020/wordml/sdtdatahash" xmlns:w16sdtfl="http://schemas.microsoft.com/office/word/2024/wordml/sdtformatlock" xmlns:w16se="http://schemas.microsoft.com/office/word/2015/wordml/symex" xmlns:wpg="http://schemas.microsoft.com/office/word/2010/wordprocessingGroup" xmlns:wpi="http://schemas.microsoft.com/office/word/2010/wordprocessingInk" xmlns:wne="http://schemas.microsoft.com/office/word/2006/wordml" xmlns:wps="http://schemas.microsoft.com/office/word/2010/wordprocessingShape" mc:Ignorable="w14 w15 w16se w16cid w16 w16cex w16sdtdh w16sdtfl w16du wp14">
+  <w:p>
+    <w:pPr>
+      <w:pStyle w:val="Footer"/>
+    </w:pPr>
+  </w:p>
+</w:ftr>
+</file>
+
+<file path=word/footer2.xml><?xml version="1.0" encoding="utf-8"?>
 <w:ftr xmlns:wpc="http://schemas.microsoft.com/office/word/2010/wordprocessingCanvas" xmlns:cx="http://schemas.microsoft.com/office/drawing/2014/chartex" xmlns:cx1="http://schemas.microsoft.com/office/drawing/2015/9/8/chartex" xmlns:cx2="http://schemas.microsoft.com/office/drawing/2015/10/21/chartex" xmlns:cx3="http://schemas.microsoft.com/office/drawing/2016/5/9/chartex" xmlns:cx4="http://schemas.microsoft.com/office/drawing/2016/5/10/chartex" xmlns:cx5="http://schemas.microsoft.com/office/drawing/2016/5/11/chartex" xmlns:cx6="http://schemas.microsoft.com/office/drawing/2016/5/12/chartex" xmlns:cx7="http://schemas.microsoft.com/office/drawing/2016/5/13/chartex" xmlns:cx8="http://schemas.microsoft.com/office/drawing/2016/5/14/chartex" xmlns:mc="http://schemas.openxmlformats.org/markup-compatibility/2006" xmlns:aink="http://schemas.microsoft.com/office/drawing/2016/ink" xmlns:am3d="http://schemas.microsoft.com/office/drawing/2017/model3d" xmlns:o="urn:schemas-microsoft-com:office:office" xmlns:oel="http://schemas.microsoft.com/office/2019/extlst" xmlns:r="http://schemas.openxmlformats.org/officeDocument/2006/relationships" xmlns:m="http://schemas.openxmlformats.org/officeDocument/2006/math" xmlns:v="urn:schemas-microsoft-com:vml" xmlns:wp14="http://schemas.microsoft.com/office/word/2010/wordprocessingDrawing" xmlns:wp="http://schemas.openxmlformats.org/drawingml/2006/wordprocessingDrawing" xmlns:w10="urn:schemas-microsoft-com:office:word" xmlns:w="http://schemas.openxmlformats.org/wordprocessingml/2006/main" xmlns:w14="http://schemas.microsoft.com/office/word/2010/wordml" xmlns:w15="http://schemas.microsoft.com/office/word/2012/wordml" xmlns:w16cex="http://schemas.microsoft.com/office/word/2018/wordml/cex" xmlns:w16cid="http://schemas.microsoft.com/office/word/2016/wordml/cid" xmlns:w16="http://schemas.microsoft.com/office/word/2018/wordml" xmlns:w16du="http://schemas.microsoft.com/office/word/2023/wordml/word16du" xmlns:w16sdtdh="http://schemas.microsoft.com/office/word/2020/wordml/sdtdatahash" xmlns:w16sdtfl="http://schemas.microsoft.com/office/word/2024/wordml/sdtformatlock" xmlns:w16se="http://schemas.microsoft.com/office/word/2015/wordml/symex" xmlns:wpg="http://schemas.microsoft.com/office/word/2010/wordprocessingGroup" xmlns:wpi="http://schemas.microsoft.com/office/word/2010/wordprocessingInk" xmlns:wne="http://schemas.microsoft.com/office/word/2006/wordml" xmlns:wps="http://schemas.microsoft.com/office/word/2010/wordprocessingShape" mc:Ignorable="w14 w15 w16se w16cid w16 w16cex w16sdtdh w16sdtfl w16du wp14">
   <w:p>
     <w:pPr>
@@ -1958,6 +1871,16 @@
       </w:rPr>
       <w:t>my work and experience.</w:t>
     </w:r>
+  </w:p>
+</w:ftr>
+</file>
+
+<file path=word/footer3.xml><?xml version="1.0" encoding="utf-8"?>
+<w:ftr xmlns:wpc="http://schemas.microsoft.com/office/word/2010/wordprocessingCanvas" xmlns:cx="http://schemas.microsoft.com/office/drawing/2014/chartex" xmlns:cx1="http://schemas.microsoft.com/office/drawing/2015/9/8/chartex" xmlns:cx2="http://schemas.microsoft.com/office/drawing/2015/10/21/chartex" xmlns:cx3="http://schemas.microsoft.com/office/drawing/2016/5/9/chartex" xmlns:cx4="http://schemas.microsoft.com/office/drawing/2016/5/10/chartex" xmlns:cx5="http://schemas.microsoft.com/office/drawing/2016/5/11/chartex" xmlns:cx6="http://schemas.microsoft.com/office/drawing/2016/5/12/chartex" xmlns:cx7="http://schemas.microsoft.com/office/drawing/2016/5/13/chartex" xmlns:cx8="http://schemas.microsoft.com/office/drawing/2016/5/14/chartex" xmlns:mc="http://schemas.openxmlformats.org/markup-compatibility/2006" xmlns:aink="http://schemas.microsoft.com/office/drawing/2016/ink" xmlns:am3d="http://schemas.microsoft.com/office/drawing/2017/model3d" xmlns:o="urn:schemas-microsoft-com:office:office" xmlns:oel="http://schemas.microsoft.com/office/2019/extlst" xmlns:r="http://schemas.openxmlformats.org/officeDocument/2006/relationships" xmlns:m="http://schemas.openxmlformats.org/officeDocument/2006/math" xmlns:v="urn:schemas-microsoft-com:vml" xmlns:wp14="http://schemas.microsoft.com/office/word/2010/wordprocessingDrawing" xmlns:wp="http://schemas.openxmlformats.org/drawingml/2006/wordprocessingDrawing" xmlns:w10="urn:schemas-microsoft-com:office:word" xmlns:w="http://schemas.openxmlformats.org/wordprocessingml/2006/main" xmlns:w14="http://schemas.microsoft.com/office/word/2010/wordml" xmlns:w15="http://schemas.microsoft.com/office/word/2012/wordml" xmlns:w16cex="http://schemas.microsoft.com/office/word/2018/wordml/cex" xmlns:w16cid="http://schemas.microsoft.com/office/word/2016/wordml/cid" xmlns:w16="http://schemas.microsoft.com/office/word/2018/wordml" xmlns:w16du="http://schemas.microsoft.com/office/word/2023/wordml/word16du" xmlns:w16sdtdh="http://schemas.microsoft.com/office/word/2020/wordml/sdtdatahash" xmlns:w16sdtfl="http://schemas.microsoft.com/office/word/2024/wordml/sdtformatlock" xmlns:w16se="http://schemas.microsoft.com/office/word/2015/wordml/symex" xmlns:wpg="http://schemas.microsoft.com/office/word/2010/wordprocessingGroup" xmlns:wpi="http://schemas.microsoft.com/office/word/2010/wordprocessingInk" xmlns:wne="http://schemas.microsoft.com/office/word/2006/wordml" xmlns:wps="http://schemas.microsoft.com/office/word/2010/wordprocessingShape" mc:Ignorable="w14 w15 w16se w16cid w16 w16cex w16sdtdh w16sdtfl w16du wp14">
+  <w:p>
+    <w:pPr>
+      <w:pStyle w:val="Footer"/>
+    </w:pPr>
   </w:p>
 </w:ftr>
 </file>

</xml_diff>